<commit_message>
I update 30 days roadmap
</commit_message>
<xml_diff>
--- a/06_MANAGEMENT/5 Years Plan & Backup/5 Years Roadmaps.docx
+++ b/06_MANAGEMENT/5 Years Plan & Backup/5 Years Roadmaps.docx
@@ -190,9 +190,15 @@
         <w:pStyle w:val="Heading4"/>
       </w:pPr>
       <w:r>
+        <w:rPr>
+          <w:highlight w:val="yellow"/>
+        </w:rPr>
         <w:t>•</w:t>
       </w:r>
       <w:r>
+        <w:rPr>
+          <w:highlight w:val="yellow"/>
+        </w:rPr>
         <w:tab/>
         <w:t>Strengthen JavaScript, React, Node.js fundamentals</w:t>
       </w:r>
@@ -346,7 +352,6 @@
         <w:pStyle w:val="Heading4"/>
       </w:pPr>
       <w:r>
-        <w:lastRenderedPageBreak/>
         <w:t>•</w:t>
       </w:r>
       <w:r>
@@ -574,7 +579,6 @@
         <w:pStyle w:val="Heading3"/>
       </w:pPr>
       <w:r>
-        <w:lastRenderedPageBreak/>
         <w:t>8</w:t>
       </w:r>
       <w:r>
@@ -729,7 +733,6 @@
         <w:pStyle w:val="Heading1"/>
       </w:pPr>
       <w:r>
-        <w:lastRenderedPageBreak/>
         <w:t xml:space="preserve">First Year </w:t>
       </w:r>
       <w:proofErr w:type="gramStart"/>
@@ -963,6 +966,13 @@
     </w:p>
     <w:p>
       <w:pPr>
+        <w:rPr>
+          <w:highlight w:val="green"/>
+        </w:rPr>
+      </w:pPr>
+    </w:p>
+    <w:p>
+      <w:pPr>
         <w:pStyle w:val="Heading2"/>
       </w:pPr>
       <w:r>
@@ -994,7 +1004,6 @@
         <w:pStyle w:val="Heading3"/>
       </w:pPr>
       <w:r>
-        <w:lastRenderedPageBreak/>
         <w:t>Progress</w:t>
       </w:r>
     </w:p>
@@ -1196,28 +1205,11 @@
     <w:p>
       <w:pPr>
         <w:pStyle w:val="Heading2"/>
+      </w:pPr>
+      <w:r>
         <w:rPr>
           <w:rFonts w:ascii="Segoe UI Emoji" w:hAnsi="Segoe UI Emoji" w:cs="Segoe UI Emoji"/>
         </w:rPr>
-      </w:pPr>
-    </w:p>
-    <w:p>
-      <w:pPr>
-        <w:pStyle w:val="Heading2"/>
-        <w:rPr>
-          <w:rFonts w:ascii="Segoe UI Emoji" w:hAnsi="Segoe UI Emoji" w:cs="Segoe UI Emoji"/>
-        </w:rPr>
-      </w:pPr>
-    </w:p>
-    <w:p>
-      <w:pPr>
-        <w:pStyle w:val="Heading2"/>
-      </w:pPr>
-      <w:r>
-        <w:rPr>
-          <w:rFonts w:ascii="Segoe UI Emoji" w:hAnsi="Segoe UI Emoji" w:cs="Segoe UI Emoji"/>
-        </w:rPr>
-        <w:lastRenderedPageBreak/>
         <w:t>👨</w:t>
       </w:r>
       <w:r>
@@ -1445,7 +1437,6 @@
         <w:pStyle w:val="Heading2"/>
       </w:pPr>
       <w:r>
-        <w:lastRenderedPageBreak/>
         <w:t>YEAR 2 — INTERMEDIATE SKILLS + STABLE CLIENT WORK</w:t>
       </w:r>
     </w:p>
@@ -1676,7 +1667,6 @@
         <w:pStyle w:val="Heading3"/>
       </w:pPr>
       <w:r>
-        <w:lastRenderedPageBreak/>
         <w:t>6</w:t>
       </w:r>
       <w:r>
@@ -1924,7 +1914,6 @@
         <w:pStyle w:val="Heading4"/>
       </w:pPr>
       <w:r>
-        <w:lastRenderedPageBreak/>
         <w:t>•</w:t>
       </w:r>
       <w:r>
@@ -1938,7 +1927,6 @@
         <w:pStyle w:val="Heading1"/>
       </w:pPr>
       <w:r>
-        <w:lastRenderedPageBreak/>
         <w:t>Third Year (2028 - 2029)</w:t>
       </w:r>
     </w:p>
@@ -2139,7 +2127,6 @@
         <w:pStyle w:val="Heading3"/>
       </w:pPr>
       <w:r>
-        <w:lastRenderedPageBreak/>
         <w:t>6</w:t>
       </w:r>
       <w:r>
@@ -2383,7 +2370,6 @@
         <w:pStyle w:val="Heading1"/>
       </w:pPr>
       <w:r>
-        <w:lastRenderedPageBreak/>
         <w:t>Fourth Year (2029 - 2030)</w:t>
       </w:r>
     </w:p>
@@ -2583,7 +2569,6 @@
         <w:pStyle w:val="Heading3"/>
       </w:pPr>
       <w:r>
-        <w:lastRenderedPageBreak/>
         <w:t>7</w:t>
       </w:r>
       <w:r>
@@ -2761,7 +2746,6 @@
         <w:pStyle w:val="Heading1"/>
       </w:pPr>
       <w:r>
-        <w:lastRenderedPageBreak/>
         <w:t>Fifth Year (2030 - 2031)</w:t>
       </w:r>
     </w:p>
@@ -2961,7 +2945,6 @@
         <w:pStyle w:val="Heading4"/>
       </w:pPr>
       <w:r>
-        <w:lastRenderedPageBreak/>
         <w:t>•</w:t>
       </w:r>
       <w:r>
@@ -3196,7 +3179,6 @@
         <w:pStyle w:val="Heading1"/>
       </w:pPr>
       <w:r>
-        <w:lastRenderedPageBreak/>
         <w:t>40 Books That Made Me Rich</w:t>
       </w:r>
     </w:p>
@@ -3464,7 +3446,6 @@
         <w:pStyle w:val="Heading3"/>
       </w:pPr>
       <w:r>
-        <w:lastRenderedPageBreak/>
         <w:t>3.1 Human Psychology</w:t>
       </w:r>
     </w:p>
@@ -3734,7 +3715,6 @@
         <w:rPr>
           <w:i/>
         </w:rPr>
-        <w:lastRenderedPageBreak/>
         <w:t>10x Is Easier Than 2x</w:t>
       </w:r>
       <w:r>
@@ -3892,7 +3872,6 @@
         <w:pStyle w:val="Heading1"/>
       </w:pPr>
       <w:r>
-        <w:lastRenderedPageBreak/>
         <w:t>Back Cover Page</w:t>
       </w:r>
     </w:p>

</xml_diff>